<commit_message>
docs: updated planning document
</commit_message>
<xml_diff>
--- a/docs/PART_1_DOCUMENT.docx
+++ b/docs/PART_1_DOCUMENT.docx
@@ -179,27 +179,7 @@
                   <w:sz w:val="28"/>
                   <w:szCs w:val="28"/>
                 </w:rPr>
-                <w:t xml:space="preserve">Gift </w:t>
-              </w:r>
-              <w:proofErr w:type="spellStart"/>
-              <w:r>
-                <w:rPr>
-                  <w:rFonts w:asciiTheme="majorBidi" w:hAnsiTheme="majorBidi" w:cstheme="majorBidi"/>
-                  <w:color w:val="5B9BD5" w:themeColor="accent1"/>
-                  <w:sz w:val="28"/>
-                  <w:szCs w:val="28"/>
-                </w:rPr>
-                <w:t>Sape</w:t>
-              </w:r>
-              <w:proofErr w:type="spellEnd"/>
-              <w:r>
-                <w:rPr>
-                  <w:rFonts w:asciiTheme="majorBidi" w:hAnsiTheme="majorBidi" w:cstheme="majorBidi"/>
-                  <w:color w:val="5B9BD5" w:themeColor="accent1"/>
-                  <w:sz w:val="28"/>
-                  <w:szCs w:val="28"/>
-                </w:rPr>
-                <w:t xml:space="preserve"> ST10476487</w:t>
+                <w:t>Gift Sape ST10476487</w:t>
               </w:r>
             </w:p>
           </w:sdtContent>
@@ -5097,12 +5077,14 @@
     </w:p>
     <w:p>
       <w:pPr>
+        <w:jc w:val="center"/>
         <w:rPr>
           <w:rStyle w:val="IntenseReference"/>
           <w:sz w:val="28"/>
           <w:szCs w:val="28"/>
         </w:rPr>
       </w:pPr>
+      <w:bookmarkStart w:id="0" w:name="_GoBack"/>
       <w:r>
         <w:rPr>
           <w:rStyle w:val="IntenseReference"/>
@@ -5133,6 +5115,7 @@
             <w:shd w:val="clear" w:color="auto" w:fill="5B9BD5" w:themeFill="accent1"/>
             <w:hideMark/>
           </w:tcPr>
+          <w:bookmarkEnd w:id="0"/>
           <w:p>
             <w:pPr>
               <w:spacing w:after="160" w:line="259" w:lineRule="auto"/>
@@ -18943,8 +18926,6 @@
           <w:szCs w:val="18"/>
         </w:rPr>
       </w:pPr>
-      <w:bookmarkStart w:id="0" w:name="_GoBack"/>
-      <w:bookmarkEnd w:id="0"/>
     </w:p>
     <w:p>
       <w:pPr>
@@ -19442,7 +19423,21 @@
           <w:sz w:val="24"/>
           <w:szCs w:val="24"/>
         </w:rPr>
-        <w:t xml:space="preserve"> with all six tables, their constraints, and enough sample data to exercise every relationship in the ERD — a participant enrolled in more than one event, an organizer running more than one event, and results captured against completed enrolments. This is the database Part 2’s API will connect to.</w:t>
+        <w:t xml:space="preserve"> with all six tables, their constraints, and enough sample data to exercis</w:t>
+      </w:r>
+      <w:r>
+        <w:rPr>
+          <w:sz w:val="24"/>
+          <w:szCs w:val="24"/>
+        </w:rPr>
+        <w:t>e every relationship in the ERD,</w:t>
+      </w:r>
+      <w:r>
+        <w:rPr>
+          <w:sz w:val="24"/>
+          <w:szCs w:val="24"/>
+        </w:rPr>
+        <w:t xml:space="preserve"> a participant enrolled in more than one event, an organizer running more than one event, and results captured against completed enrolments. This is the database Part 2’s API will connect to.</w:t>
       </w:r>
     </w:p>
     <w:p>
@@ -20186,6 +20181,7 @@
     <w:rsid w:val="00331803"/>
     <w:rsid w:val="00391FA5"/>
     <w:rsid w:val="0045194D"/>
+    <w:rsid w:val="00DE0237"/>
     <w:rsid w:val="00F406FB"/>
   </w:rsids>
   <m:mathPr>
@@ -20914,7 +20910,7 @@
 </file>
 
 <file path=customXml/itemProps1.xml><?xml version="1.0" encoding="utf-8"?>
-<ds:datastoreItem xmlns:ds="http://schemas.openxmlformats.org/officeDocument/2006/customXml" ds:itemID="{2A9B3F3B-0AE9-4BB0-9FD1-13276C51DFD3}">
+<ds:datastoreItem xmlns:ds="http://schemas.openxmlformats.org/officeDocument/2006/customXml" ds:itemID="{9FAC1A6A-2189-45C7-9DC8-7399F0D2BF95}">
   <ds:schemaRefs>
     <ds:schemaRef ds:uri="http://schemas.openxmlformats.org/officeDocument/2006/bibliography"/>
   </ds:schemaRefs>

</xml_diff>